<commit_message>
docs(assignment): replace math-notation symbols with readable Manchester syntax in report
Swapped u2293/u2291/u2261/u00ac/u2294 (intersection/subclass/equivalent/
not/union symbols) for plain readable text (and/or/not, SubClassOf:/
EquivalentTo:) in the restriction-justification and inferred-facts
tables - matches the Manchester syntax used everywhere else in the
report and in Protege itself, and avoids rendering issues in some
viewers/fonts.
</commit_message>
<xml_diff>
--- a/assignment/Submission/258843A_Assignment_Report.docx
+++ b/assignment/Submission/258843A_Assignment_Report.docx
@@ -876,7 +876,7 @@
           </w:tcPr>
           <w:p>
             <w:r>
-              <w:t>Product ⊑ hasBrand some Brand</w:t>
+              <w:t>Product SubClassOf: hasBrand some Brand</w:t>
             </w:r>
           </w:p>
         </w:tc>
@@ -908,7 +908,7 @@
           </w:tcPr>
           <w:p>
             <w:r>
-              <w:t>SmartProduct ≡ Product ⊓ hasFeature some SmartFeature</w:t>
+              <w:t>SmartProduct EquivalentTo: Product and hasFeature some SmartFeature</w:t>
             </w:r>
           </w:p>
         </w:tc>
@@ -940,7 +940,7 @@
           </w:tcPr>
           <w:p>
             <w:r>
-              <w:t>FullySmartProduct ≡ Product ⊓ hasFeature only (SmartFeature ⊔ WiFiFeature ⊔ BluetoothFeature)</w:t>
+              <w:t>FullySmartProduct EquivalentTo: Product and hasFeature only (SmartFeature or WiFiFeature or BluetoothFeature)</w:t>
             </w:r>
           </w:p>
         </w:tc>
@@ -972,7 +972,7 @@
           </w:tcPr>
           <w:p>
             <w:r>
-              <w:t>PremiumProduct ≡ Product ⊓ hasPrice some xsd:decimal[&gt;=150000]</w:t>
+              <w:t>PremiumProduct EquivalentTo: Product and hasPrice some xsd:decimal[&gt;=150000]</w:t>
             </w:r>
           </w:p>
         </w:tc>
@@ -1004,7 +1004,7 @@
           </w:tcPr>
           <w:p>
             <w:r>
-              <w:t>BudgetProduct ≡ Product ⊓ ¬PremiumProduct</w:t>
+              <w:t>BudgetProduct EquivalentTo: Product and not PremiumProduct</w:t>
             </w:r>
           </w:p>
         </w:tc>
@@ -1036,7 +1036,7 @@
           </w:tcPr>
           <w:p>
             <w:r>
-              <w:t>FullyLoadedProduct ≡ Product ⊓ hasFeature min 3</w:t>
+              <w:t>FullyLoadedProduct EquivalentTo: Product and hasFeature min 3</w:t>
             </w:r>
           </w:p>
         </w:tc>
@@ -1068,7 +1068,7 @@
           </w:tcPr>
           <w:p>
             <w:r>
-              <w:t>ColomboAvailableProduct ≡ Product ⊓ availableAt some (Showroom ⊓ locatedIn value Colombo)</w:t>
+              <w:t>ColomboAvailableProduct EquivalentTo: Product and availableAt some (Showroom and locatedIn value Colombo)</w:t>
             </w:r>
           </w:p>
         </w:tc>
@@ -1236,7 +1236,7 @@
           </w:tcPr>
           <w:p>
             <w:r>
-              <w:t>SmartProduct ≡ Product ⊓ hasFeature some SmartFeature; iPhone_15_Pro has a SmartFeature asserted</w:t>
+              <w:t>SmartProduct EquivalentTo: Product and hasFeature some SmartFeature; iPhone_15_Pro has a SmartFeature asserted</w:t>
             </w:r>
           </w:p>
         </w:tc>

</xml_diff>

<commit_message>
docs(assignment): promote Limitations/Future Improvements to own section, add deliverables checklist and video reference
Addressed a full pass against the brief's 'Required Deliverables' list
(Section 5):
- Limitations and Future Improvements moved out of Task 6's inline
  bullet list into its own standalone, clearly-titled section with
  expanded bullet lists (5 limitations, 6 future improvements).
- Added a Presentation and Demonstration section referencing
  258843A_Ontology_Demo.mp4, which existed on disk but was never
  mentioned in the report itself.
- Added a Required Deliverables Checklist table mapping all 8 listed
  items (ontology file, reasoning evidence, diagram, bonus app,
  presentation, limitations, conclusion, references) to exactly where
  each is satisfied - makes it trivial for a marker to verify nothing
  was missed.
</commit_message>
<xml_diff>
--- a/assignment/Submission/258843A_Assignment_Report.docx
+++ b/assignment/Submission/258843A_Assignment_Report.docx
@@ -2416,25 +2416,115 @@
       </w:r>
     </w:p>
     <w:p>
+      <w:pPr>
+        <w:pStyle w:val="Heading1"/>
+      </w:pPr>
       <w:r>
-        <w:rPr>
-          <w:b/>
-        </w:rPr>
-        <w:t xml:space="preserve">Limitations: </w:t>
-      </w:r>
-      <w:r>
-        <w:t>Scope is limited to 4 of Abans' 13 real categories; prices are modeled as plain decimals without currency/locale typing; stock quantities and multi-currency pricing are not modeled; the ontology does not model customer accounts or transactions.</w:t>
+        <w:t>Limitations and Future Improvements</w:t>
       </w:r>
     </w:p>
     <w:p>
+      <w:pPr>
+        <w:pStyle w:val="Heading2"/>
+      </w:pPr>
       <w:r>
-        <w:rPr>
-          <w:b/>
-        </w:rPr>
-        <w:t xml:space="preserve">Future improvements: </w:t>
+        <w:t>Current Limitations</w:t>
       </w:r>
+    </w:p>
+    <w:p>
+      <w:pPr>
+        <w:pStyle w:val="ListBullet"/>
+      </w:pPr>
       <w:r>
-        <w:t>Extend to the remaining catalog categories; add a Currency/Price value object; add temporal properties for stock/discount validity; integrate live product data via a scheduled import instead of static individuals.</w:t>
+        <w:t>Scope is limited to 4 of Abans' 13 real catalog categories (TV, Home Appliances, Mobile Devices, Computers) - the remaining nine (Kitchen Appliances, Fashion &amp; Lifestyle, MINISO, Personal Care, Commercial Appliances, Kids Toys, Furniture &amp; Home Style, Audio &amp; Entertainment, Apple) are not modeled.</w:t>
+      </w:r>
+    </w:p>
+    <w:p>
+      <w:pPr>
+        <w:pStyle w:val="ListBullet"/>
+      </w:pPr>
+      <w:r>
+        <w:t>Prices are modeled as plain xsd:decimal values without an explicit Currency class or locale typing.</w:t>
+      </w:r>
+    </w:p>
+    <w:p>
+      <w:pPr>
+        <w:pStyle w:val="ListBullet"/>
+      </w:pPr>
+      <w:r>
+        <w:t>Stock quantities, discounts/promotions, and multi-currency pricing are not modeled.</w:t>
+      </w:r>
+    </w:p>
+    <w:p>
+      <w:pPr>
+        <w:pStyle w:val="ListBullet"/>
+      </w:pPr>
+      <w:r>
+        <w:t>Customer accounts, orders, and transactions are out of scope - the ontology models the catalog, not the sales process.</w:t>
+      </w:r>
+    </w:p>
+    <w:p>
+      <w:pPr>
+        <w:pStyle w:val="ListBullet"/>
+      </w:pPr>
+      <w:r>
+        <w:t>The showroom network covers only 3 representative branches (Colombo, Kandy, Galle) out of Abans' real 400+ showrooms, chosen to demonstrate the transitive location property without modeling the full branch list.</w:t>
+      </w:r>
+    </w:p>
+    <w:p>
+      <w:pPr>
+        <w:pStyle w:val="Heading2"/>
+      </w:pPr>
+      <w:r>
+        <w:t>Future Improvements</w:t>
+      </w:r>
+    </w:p>
+    <w:p>
+      <w:pPr>
+        <w:pStyle w:val="ListBullet"/>
+      </w:pPr>
+      <w:r>
+        <w:t>Extend the category hierarchy to Abans' remaining nine catalog categories using the same disjoint-category pattern already established.</w:t>
+      </w:r>
+    </w:p>
+    <w:p>
+      <w:pPr>
+        <w:pStyle w:val="ListBullet"/>
+      </w:pPr>
+      <w:r>
+        <w:t>Add a Currency/Money value object so prices are locale-aware rather than plain decimals.</w:t>
+      </w:r>
+    </w:p>
+    <w:p>
+      <w:pPr>
+        <w:pStyle w:val="ListBullet"/>
+      </w:pPr>
+      <w:r>
+        <w:t>Add temporal properties (e.g. discount validity periods, stock-availability timestamps) to support time-sensitive competency questions.</w:t>
+      </w:r>
+    </w:p>
+    <w:p>
+      <w:pPr>
+        <w:pStyle w:val="ListBullet"/>
+      </w:pPr>
+      <w:r>
+        <w:t>Expand the showroom network to Abans' full real branch list, and add richer geographic modeling (district-level, not just province-level).</w:t>
+      </w:r>
+    </w:p>
+    <w:p>
+      <w:pPr>
+        <w:pStyle w:val="ListBullet"/>
+      </w:pPr>
+      <w:r>
+        <w:t>Integrate live product data via a scheduled import/ETL process instead of static hand-entered individuals, keeping the ontology's structure but automating its ABox population.</w:t>
+      </w:r>
+    </w:p>
+    <w:p>
+      <w:pPr>
+        <w:pStyle w:val="ListBullet"/>
+      </w:pPr>
+      <w:r>
+        <w:t>Add a SHACL or OWL-based data-quality validation layer to catch modeling errors earlier, complementing the reasoner's consistency checks.</w:t>
       </w:r>
     </w:p>
     <w:p>
@@ -2544,6 +2634,246 @@
         <w:t>Running CQ5 (SmartProduct), CQ6 (EcoFriendlyProduct), CQ7 (PremiumProduct), CQ8 (BudgetProduct) or CQ12 (FullyLoadedProduct) through the application returns results that depend entirely on reasoner-inferred class membership, materialised into the exported OWL file as described in Task 5. Screenshots of these queries running in the application are attached at the end of this report.</w:t>
       </w:r>
     </w:p>
+    <w:p>
+      <w:pPr>
+        <w:pStyle w:val="Heading1"/>
+      </w:pPr>
+      <w:r>
+        <w:t>Presentation and Demonstration</w:t>
+      </w:r>
+    </w:p>
+    <w:p>
+      <w:r>
+        <w:t>A five-minute screen-recorded demonstration (258843A_Ontology_Demo.mp4, included in the submission) walks through the ontology's class hierarchy, restriction types, live reasoner classification, the Open World Assumption demonstration, the real showroom/transitive-location structure, and a live run of the FastAPI/Streamlit application.</w:t>
+      </w:r>
+    </w:p>
+    <w:p>
+      <w:pPr>
+        <w:pStyle w:val="Heading1"/>
+      </w:pPr>
+      <w:r>
+        <w:t>Required Deliverables Checklist</w:t>
+      </w:r>
+    </w:p>
+    <w:tbl>
+      <w:tblPr>
+        <w:tblStyle w:val="LightGrid-Accent1"/>
+        <w:tblW w:type="auto" w:w="0"/>
+        <w:tblLook w:firstColumn="1" w:firstRow="1" w:lastColumn="0" w:lastRow="0" w:noHBand="0" w:noVBand="1" w:val="04A0"/>
+      </w:tblPr>
+      <w:tblGrid>
+        <w:gridCol w:w="4320"/>
+        <w:gridCol w:w="4320"/>
+      </w:tblGrid>
+      <w:tr>
+        <w:tc>
+          <w:tcPr>
+            <w:tcW w:type="dxa" w:w="4320"/>
+            <w:shd w:fill="1F4E78"/>
+          </w:tcPr>
+          <w:p>
+            <w:r>
+              <w:rPr>
+                <w:b/>
+                <w:color w:val="FFFFFF"/>
+              </w:rPr>
+              <w:t>Deliverable</w:t>
+            </w:r>
+          </w:p>
+        </w:tc>
+        <w:tc>
+          <w:tcPr>
+            <w:tcW w:type="dxa" w:w="4320"/>
+            <w:shd w:fill="1F4E78"/>
+          </w:tcPr>
+          <w:p>
+            <w:r>
+              <w:rPr>
+                <w:b/>
+                <w:color w:val="FFFFFF"/>
+              </w:rPr>
+              <w:t>Where it is satisfied</w:t>
+            </w:r>
+          </w:p>
+        </w:tc>
+      </w:tr>
+      <w:tr>
+        <w:tc>
+          <w:tcPr>
+            <w:tcW w:type="dxa" w:w="4320"/>
+          </w:tcPr>
+          <w:p>
+            <w:r>
+              <w:t>Ontology file (.owl)</w:t>
+            </w:r>
+          </w:p>
+        </w:tc>
+        <w:tc>
+          <w:tcPr>
+            <w:tcW w:type="dxa" w:w="4320"/>
+          </w:tcPr>
+          <w:p>
+            <w:r>
+              <w:t>abans.owl - included in the submission and the GitHub repository.</w:t>
+            </w:r>
+          </w:p>
+        </w:tc>
+      </w:tr>
+      <w:tr>
+        <w:tc>
+          <w:tcPr>
+            <w:tcW w:type="dxa" w:w="4320"/>
+          </w:tcPr>
+          <w:p>
+            <w:r>
+              <w:t>Reasoning evidence (screenshots / exported results)</w:t>
+            </w:r>
+          </w:p>
+        </w:tc>
+        <w:tc>
+          <w:tcPr>
+            <w:tcW w:type="dxa" w:w="4320"/>
+          </w:tcPr>
+          <w:p>
+            <w:r>
+              <w:t>Task 4's inferred-facts table plus the query results documented in Task 5; screenshots attached at the end of this report.</w:t>
+            </w:r>
+          </w:p>
+        </w:tc>
+      </w:tr>
+      <w:tr>
+        <w:tc>
+          <w:tcPr>
+            <w:tcW w:type="dxa" w:w="4320"/>
+          </w:tcPr>
+          <w:p>
+            <w:r>
+              <w:t>Ontology diagram in the report</w:t>
+            </w:r>
+          </w:p>
+        </w:tc>
+        <w:tc>
+          <w:tcPr>
+            <w:tcW w:type="dxa" w:w="4320"/>
+          </w:tcPr>
+          <w:p>
+            <w:r>
+              <w:t>Included in Task 2.</w:t>
+            </w:r>
+          </w:p>
+        </w:tc>
+      </w:tr>
+      <w:tr>
+        <w:tc>
+          <w:tcPr>
+            <w:tcW w:type="dxa" w:w="4320"/>
+          </w:tcPr>
+          <w:p>
+            <w:r>
+              <w:t>Bonus application source code and setup instructions</w:t>
+            </w:r>
+          </w:p>
+        </w:tc>
+        <w:tc>
+          <w:tcPr>
+            <w:tcW w:type="dxa" w:w="4320"/>
+          </w:tcPr>
+          <w:p>
+            <w:r>
+              <w:t>Full source in the GitHub repository (backend/, frontend/); setup instructions in the Bonus Task section above.</w:t>
+            </w:r>
+          </w:p>
+        </w:tc>
+      </w:tr>
+      <w:tr>
+        <w:tc>
+          <w:tcPr>
+            <w:tcW w:type="dxa" w:w="4320"/>
+          </w:tcPr>
+          <w:p>
+            <w:r>
+              <w:t>Short presentation / live demonstration</w:t>
+            </w:r>
+          </w:p>
+        </w:tc>
+        <w:tc>
+          <w:tcPr>
+            <w:tcW w:type="dxa" w:w="4320"/>
+          </w:tcPr>
+          <w:p>
+            <w:r>
+              <w:t>258843A_Ontology_Demo.mp4, included in the submission.</w:t>
+            </w:r>
+          </w:p>
+        </w:tc>
+      </w:tr>
+      <w:tr>
+        <w:tc>
+          <w:tcPr>
+            <w:tcW w:type="dxa" w:w="4320"/>
+          </w:tcPr>
+          <w:p>
+            <w:r>
+              <w:t>Limitations and future improvements</w:t>
+            </w:r>
+          </w:p>
+        </w:tc>
+        <w:tc>
+          <w:tcPr>
+            <w:tcW w:type="dxa" w:w="4320"/>
+          </w:tcPr>
+          <w:p>
+            <w:r>
+              <w:t>Own section above.</w:t>
+            </w:r>
+          </w:p>
+        </w:tc>
+      </w:tr>
+      <w:tr>
+        <w:tc>
+          <w:tcPr>
+            <w:tcW w:type="dxa" w:w="4320"/>
+          </w:tcPr>
+          <w:p>
+            <w:r>
+              <w:t>Conclusion</w:t>
+            </w:r>
+          </w:p>
+        </w:tc>
+        <w:tc>
+          <w:tcPr>
+            <w:tcW w:type="dxa" w:w="4320"/>
+          </w:tcPr>
+          <w:p>
+            <w:r>
+              <w:t>Own section below.</w:t>
+            </w:r>
+          </w:p>
+        </w:tc>
+      </w:tr>
+      <w:tr>
+        <w:tc>
+          <w:tcPr>
+            <w:tcW w:type="dxa" w:w="4320"/>
+          </w:tcPr>
+          <w:p>
+            <w:r>
+              <w:t>References</w:t>
+            </w:r>
+          </w:p>
+        </w:tc>
+        <w:tc>
+          <w:tcPr>
+            <w:tcW w:type="dxa" w:w="4320"/>
+          </w:tcPr>
+          <w:p>
+            <w:r>
+              <w:t>Own section below.</w:t>
+            </w:r>
+          </w:p>
+        </w:tc>
+      </w:tr>
+    </w:tbl>
     <w:p>
       <w:pPr>
         <w:pStyle w:val="Heading1"/>

</xml_diff>